<commit_message>
feat(sdd2): enforce simplified Chinese artifacts
</commit_message>
<xml_diff>
--- a/docs/UAW-SDD2.0 Skill化方案说明与操作指南.docx
+++ b/docs/UAW-SDD2.0 Skill化方案说明与操作指南.docx
@@ -47,7 +47,7 @@
           <w:color w:val="637384"/>
           <w:sz w:val="23"/>
         </w:rPr>
-        <w:t>稳定入口  ·  确定性状态  ·  可追溯审批  ·  冻结范围  ·  可恢复执行</w:t>
+        <w:t>稳定入口  ·  中文主体  ·  确定性状态  ·  可追溯审批  ·  可恢复执行</w:t>
       </w:r>
     </w:p>
     <w:tbl>
@@ -123,7 +123,7 @@
                 <w:color w:val="1E2933"/>
                 <w:sz w:val="21"/>
               </w:rPr>
-              <w:t>开发者仍然只需提交简要提示词并调用 uaw-sdd-ai-coding；状态、审批、Git 范围、失效和恢复全部由 Skill 内部处理。</w:t>
+              <w:t>开发者仍然只需提交简要提示词并调用 uaw-sdd-ai-coding；状态、审批、Git 范围、失效和恢复全部由 Skill 内部处理，新生成过程资产以简体中文为主体。</w:t>
             </w:r>
           </w:p>
         </w:tc>
@@ -278,7 +278,7 @@
                 <w:color w:val="1E2933"/>
                 <w:sz w:val="19"/>
               </w:rPr>
-              <w:t>2.0-hardened / 2026-07-14</w:t>
+              <w:t>2.0-hardened / 2026-07-15</w:t>
             </w:r>
           </w:p>
         </w:tc>
@@ -1739,6 +1739,106 @@
     </w:p>
     <w:p>
       <w:pPr>
+        <w:pStyle w:val="Heading2"/>
+        <w:keepNext/>
+        <w:keepLines w:val="0"/>
+      </w:pPr>
+      <w:r>
+        <w:t>2.1 简体中文主体规范</w:t>
+      </w:r>
+    </w:p>
+    <w:p>
+      <w:pPr>
+        <w:keepNext w:val="0"/>
+        <w:keepLines/>
+      </w:pPr>
+      <w:r>
+        <w:rPr>
+          <w:rFonts w:ascii="Arial Unicode MS" w:hAnsi="Arial Unicode MS" w:eastAsia="Arial Unicode MS"/>
+        </w:rPr>
+        <w:t>三项 Skill 的人类可读运行规则、模板以及新建或修订的九项公开资产，统一以简体中文为主体。唯一语言规则来源是 skills/uaw-sdd-ai-coding/references/language-policy.md。</w:t>
+      </w:r>
+    </w:p>
+    <w:p>
+      <w:pPr>
+        <w:pStyle w:val="ListBullet"/>
+        <w:keepNext w:val="0"/>
+        <w:keepLines/>
+      </w:pPr>
+      <w:r>
+        <w:rPr>
+          <w:rFonts w:ascii="Arial Unicode MS" w:hAnsi="Arial Unicode MS" w:eastAsia="Arial Unicode MS"/>
+        </w:rPr>
+        <w:t>标题、说明、事实、判断、风险、验收、评审发现、测试结论和归档总结使用简体中文。</w:t>
+      </w:r>
+    </w:p>
+    <w:p>
+      <w:pPr>
+        <w:pStyle w:val="ListBullet"/>
+        <w:keepNext w:val="0"/>
+        <w:keepLines/>
+      </w:pPr>
+      <w:r>
+        <w:rPr>
+          <w:rFonts w:ascii="Arial Unicode MS" w:hAnsi="Arial Unicode MS" w:eastAsia="Arial Unicode MS"/>
+        </w:rPr>
+        <w:t>文件名、路径、命令、代码标识符、Schema 键、状态枚举、技术缩写和外部契约原值可保留英文。</w:t>
+      </w:r>
+    </w:p>
+    <w:p>
+      <w:pPr>
+        <w:pStyle w:val="ListBullet"/>
+        <w:keepNext w:val="0"/>
+        <w:keepLines/>
+      </w:pPr>
+      <w:r>
+        <w:rPr>
+          <w:rFonts w:ascii="Arial Unicode MS" w:hAnsi="Arial Unicode MS" w:eastAsia="Arial Unicode MS"/>
+        </w:rPr>
+        <w:t>用户以英文提交需求时，资产分析和结论仍使用简体中文；需要追溯的原文可按原样引用并标注来源。</w:t>
+      </w:r>
+    </w:p>
+    <w:p>
+      <w:pPr>
+        <w:pStyle w:val="ListBullet"/>
+        <w:keepNext w:val="0"/>
+        <w:keepLines/>
+      </w:pPr>
+      <w:r>
+        <w:rPr>
+          <w:rFonts w:ascii="Arial Unicode MS" w:hAnsi="Arial Unicode MS" w:eastAsia="Arial Unicode MS"/>
+        </w:rPr>
+        <w:t>控制器在 init 和 record-artifact 时执行语言校验；不符合规范时返回非零并阻塞当前动作。</w:t>
+      </w:r>
+    </w:p>
+    <w:p>
+      <w:pPr>
+        <w:pStyle w:val="ListBullet"/>
+        <w:keepNext w:val="0"/>
+        <w:keepLines/>
+      </w:pPr>
+      <w:r>
+        <w:rPr>
+          <w:rFonts w:ascii="Arial Unicode MS" w:hAnsi="Arial Unicode MS" w:eastAsia="Arial Unicode MS"/>
+        </w:rPr>
+        <w:t>historical-example 是不可变审计样例，为保持哈希和迁移证据不回写翻译，也不得复制为新资产。</w:t>
+      </w:r>
+    </w:p>
+    <w:p>
+      <w:pPr>
+        <w:pStyle w:val="ListBullet"/>
+        <w:keepNext w:val="0"/>
+        <w:keepLines/>
+      </w:pPr>
+      <w:r>
+        <w:rPr>
+          <w:rFonts w:ascii="Arial Unicode MS" w:hAnsi="Arial Unicode MS" w:eastAsia="Arial Unicode MS"/>
+        </w:rPr>
+        <w:t>original/ 是保留原文和来源哈希的导入档案，不作为运行规则；面向运行的派生内容必须在 references/ 中以简体中文表达。</w:t>
+      </w:r>
+    </w:p>
+    <w:p>
+      <w:pPr>
         <w:pStyle w:val="Heading1"/>
         <w:keepNext/>
         <w:keepLines w:val="0"/>
@@ -1809,6 +1909,19 @@
           <w:rFonts w:ascii="Arial Unicode MS" w:hAnsi="Arial Unicode MS" w:eastAsia="Arial Unicode MS"/>
         </w:rPr>
         <w:t>references/schemas/：持久化状态、审批和范围的数据结构约束。</w:t>
+      </w:r>
+    </w:p>
+    <w:p>
+      <w:pPr>
+        <w:pStyle w:val="ListNumber"/>
+        <w:keepNext w:val="0"/>
+        <w:keepLines/>
+      </w:pPr>
+      <w:r>
+        <w:rPr>
+          <w:rFonts w:ascii="Arial Unicode MS" w:hAnsi="Arial Unicode MS" w:eastAsia="Arial Unicode MS"/>
+        </w:rPr>
+        <w:t>language-policy.md：人类可读文件与生成资产的简体中文主体要求。</w:t>
       </w:r>
     </w:p>
     <w:p>
@@ -15908,7 +16021,7 @@
                 <w:color w:val="1E2933"/>
                 <w:sz w:val="16"/>
               </w:rPr>
-              <w:t>可维护性</w:t>
+              <w:t>语言一致性</w:t>
             </w:r>
           </w:p>
         </w:tc>
@@ -15942,7 +16055,7 @@
                 <w:color w:val="1E2933"/>
                 <w:sz w:val="16"/>
               </w:rPr>
-              <w:t>契约唯一来源、Schema、路由和 provenance 完整</w:t>
+              <w:t>运行规则和新资产以简体中文为主体，必要英文受控保留</w:t>
             </w:r>
           </w:p>
         </w:tc>
@@ -15950,6 +16063,113 @@
           <w:tcPr>
             <w:tcW w:type="dxa" w:w="2891"/>
             <w:shd w:fill="FFFFFF"/>
+            <w:tcBorders>
+              <w:top w:val="single" w:sz="4" w:color="A8BBCB"/>
+              <w:left w:val="single" w:sz="4" w:color="A8BBCB"/>
+              <w:bottom w:val="single" w:sz="4" w:color="A8BBCB"/>
+              <w:right w:val="single" w:sz="4" w:color="A8BBCB"/>
+              <w:insideH w:val="single" w:sz="4" w:color="A8BBCB"/>
+              <w:insideV w:val="single" w:sz="4" w:color="A8BBCB"/>
+            </w:tcBorders>
+            <w:tcMar>
+              <w:top w:w="90" w:type="dxa"/>
+              <w:start w:w="110" w:type="dxa"/>
+              <w:bottom w:w="90" w:type="dxa"/>
+              <w:end w:w="110" w:type="dxa"/>
+            </w:tcMar>
+            <w:vAlign w:val="top"/>
+          </w:tcPr>
+          <w:p>
+            <w:pPr>
+              <w:spacing w:after="0"/>
+            </w:pPr>
+            <w:r>
+              <w:rPr>
+                <w:rFonts w:ascii="Arial Unicode MS" w:hAnsi="Arial Unicode MS" w:eastAsia="Arial Unicode MS"/>
+                <w:color w:val="1E2933"/>
+                <w:sz w:val="16"/>
+              </w:rPr>
+              <w:t>init / record-artifact 正反例与静态语言校验</w:t>
+            </w:r>
+          </w:p>
+        </w:tc>
+      </w:tr>
+      <w:tr>
+        <w:trPr>
+          <w:cantSplit/>
+        </w:trPr>
+        <w:tc>
+          <w:tcPr>
+            <w:tcW w:type="dxa" w:w="2041"/>
+            <w:shd w:fill="F7F9FB"/>
+            <w:tcBorders>
+              <w:top w:val="single" w:sz="4" w:color="A8BBCB"/>
+              <w:left w:val="single" w:sz="4" w:color="A8BBCB"/>
+              <w:bottom w:val="single" w:sz="4" w:color="A8BBCB"/>
+              <w:right w:val="single" w:sz="4" w:color="A8BBCB"/>
+              <w:insideH w:val="single" w:sz="4" w:color="A8BBCB"/>
+              <w:insideV w:val="single" w:sz="4" w:color="A8BBCB"/>
+            </w:tcBorders>
+            <w:tcMar>
+              <w:top w:w="90" w:type="dxa"/>
+              <w:start w:w="110" w:type="dxa"/>
+              <w:bottom w:w="90" w:type="dxa"/>
+              <w:end w:w="110" w:type="dxa"/>
+            </w:tcMar>
+            <w:vAlign w:val="top"/>
+          </w:tcPr>
+          <w:p>
+            <w:pPr>
+              <w:spacing w:after="0"/>
+            </w:pPr>
+            <w:r>
+              <w:rPr>
+                <w:rFonts w:ascii="Arial Unicode MS" w:hAnsi="Arial Unicode MS" w:eastAsia="Arial Unicode MS"/>
+                <w:color w:val="1E2933"/>
+                <w:sz w:val="16"/>
+              </w:rPr>
+              <w:t>可维护性</w:t>
+            </w:r>
+          </w:p>
+        </w:tc>
+        <w:tc>
+          <w:tcPr>
+            <w:tcW w:type="dxa" w:w="5216"/>
+            <w:shd w:fill="F7F9FB"/>
+            <w:tcBorders>
+              <w:top w:val="single" w:sz="4" w:color="A8BBCB"/>
+              <w:left w:val="single" w:sz="4" w:color="A8BBCB"/>
+              <w:bottom w:val="single" w:sz="4" w:color="A8BBCB"/>
+              <w:right w:val="single" w:sz="4" w:color="A8BBCB"/>
+              <w:insideH w:val="single" w:sz="4" w:color="A8BBCB"/>
+              <w:insideV w:val="single" w:sz="4" w:color="A8BBCB"/>
+            </w:tcBorders>
+            <w:tcMar>
+              <w:top w:w="90" w:type="dxa"/>
+              <w:start w:w="110" w:type="dxa"/>
+              <w:bottom w:w="90" w:type="dxa"/>
+              <w:end w:w="110" w:type="dxa"/>
+            </w:tcMar>
+            <w:vAlign w:val="top"/>
+          </w:tcPr>
+          <w:p>
+            <w:pPr>
+              <w:spacing w:after="0"/>
+            </w:pPr>
+            <w:r>
+              <w:rPr>
+                <w:rFonts w:ascii="Arial Unicode MS" w:hAnsi="Arial Unicode MS" w:eastAsia="Arial Unicode MS"/>
+                <w:color w:val="1E2933"/>
+                <w:sz w:val="16"/>
+              </w:rPr>
+              <w:t>契约唯一来源、Schema、路由和 provenance 完整</w:t>
+            </w:r>
+          </w:p>
+        </w:tc>
+        <w:tc>
+          <w:tcPr>
+            <w:tcW w:type="dxa" w:w="2891"/>
+            <w:shd w:fill="F7F9FB"/>
             <w:tcBorders>
               <w:top w:val="single" w:sz="4" w:color="A8BBCB"/>
               <w:left w:val="single" w:sz="4" w:color="A8BBCB"/>
@@ -16210,7 +16430,7 @@
         <w:rPr>
           <w:rFonts w:ascii="Arial Unicode MS" w:hAnsi="Arial Unicode MS" w:eastAsia="Arial Unicode MS"/>
         </w:rPr>
-        <w:t>静态验证必须覆盖运行资产、Schema、引用、来源映射、历史样例隔离和不变入口。</w:t>
+        <w:t>静态验证必须覆盖运行资产、简体中文主体、Schema、引用、来源映射、历史样例隔离和不变入口。</w:t>
       </w:r>
     </w:p>
     <w:p>
@@ -16589,7 +16809,7 @@
                 <w:color w:val="1E2933"/>
                 <w:sz w:val="17"/>
               </w:rPr>
-              <w:t>异常路径</w:t>
+              <w:t>语言规范</w:t>
             </w:r>
           </w:p>
         </w:tc>
@@ -16623,7 +16843,7 @@
                 <w:color w:val="1E2933"/>
                 <w:sz w:val="17"/>
               </w:rPr>
-              <w:t>失败/阻塞/重试/风险关闭/中止均有确定行为</w:t>
+              <w:t>运行规则及新建或修订资产以简体中文为主体，必要英文不改变机器契约</w:t>
             </w:r>
           </w:p>
         </w:tc>
@@ -16662,7 +16882,7 @@
                 <w:color w:val="1E2933"/>
                 <w:sz w:val="17"/>
               </w:rPr>
-              <w:t>历史样例</w:t>
+              <w:t>异常路径</w:t>
             </w:r>
           </w:p>
         </w:tc>
@@ -16696,7 +16916,7 @@
                 <w:color w:val="1E2933"/>
                 <w:sz w:val="17"/>
               </w:rPr>
-              <w:t>明确隔离，不含可被误认为当前审批的记录</w:t>
+              <w:t>失败/阻塞/重试/风险关闭/中止均有确定行为</w:t>
             </w:r>
           </w:p>
         </w:tc>
@@ -16735,7 +16955,7 @@
                 <w:color w:val="1E2933"/>
                 <w:sz w:val="17"/>
               </w:rPr>
-              <w:t>文档与图示</w:t>
+              <w:t>历史样例</w:t>
             </w:r>
           </w:p>
         </w:tc>
@@ -16769,7 +16989,7 @@
                 <w:color w:val="1E2933"/>
                 <w:sz w:val="17"/>
               </w:rPr>
-              <w:t>只描述当前 SDD2.0 运行基线，内容与控制契约一致</w:t>
+              <w:t>明确隔离，不含可被误认为当前审批的记录</w:t>
             </w:r>
           </w:p>
         </w:tc>
@@ -16808,7 +17028,7 @@
                 <w:color w:val="1E2933"/>
                 <w:sz w:val="17"/>
               </w:rPr>
-              <w:t>验证</w:t>
+              <w:t>文档与图示</w:t>
             </w:r>
           </w:p>
         </w:tc>
@@ -16816,6 +17036,79 @@
           <w:tcPr>
             <w:tcW w:type="dxa" w:w="7257"/>
             <w:shd w:fill="F7F9FB"/>
+            <w:tcBorders>
+              <w:top w:val="single" w:sz="4" w:color="A8BBCB"/>
+              <w:left w:val="single" w:sz="4" w:color="A8BBCB"/>
+              <w:bottom w:val="single" w:sz="4" w:color="A8BBCB"/>
+              <w:right w:val="single" w:sz="4" w:color="A8BBCB"/>
+              <w:insideH w:val="single" w:sz="4" w:color="A8BBCB"/>
+              <w:insideV w:val="single" w:sz="4" w:color="A8BBCB"/>
+            </w:tcBorders>
+            <w:tcMar>
+              <w:top w:w="90" w:type="dxa"/>
+              <w:start w:w="110" w:type="dxa"/>
+              <w:bottom w:w="90" w:type="dxa"/>
+              <w:end w:w="110" w:type="dxa"/>
+            </w:tcMar>
+            <w:vAlign w:val="top"/>
+          </w:tcPr>
+          <w:p>
+            <w:pPr>
+              <w:spacing w:after="0"/>
+            </w:pPr>
+            <w:r>
+              <w:rPr>
+                <w:rFonts w:ascii="Arial Unicode MS" w:hAnsi="Arial Unicode MS" w:eastAsia="Arial Unicode MS"/>
+                <w:color w:val="1E2933"/>
+                <w:sz w:val="17"/>
+              </w:rPr>
+              <w:t>只描述当前 SDD2.0 运行基线，内容与控制契约一致</w:t>
+            </w:r>
+          </w:p>
+        </w:tc>
+      </w:tr>
+      <w:tr>
+        <w:trPr>
+          <w:cantSplit/>
+        </w:trPr>
+        <w:tc>
+          <w:tcPr>
+            <w:tcW w:type="dxa" w:w="2835"/>
+            <w:shd w:fill="FFFFFF"/>
+            <w:tcBorders>
+              <w:top w:val="single" w:sz="4" w:color="A8BBCB"/>
+              <w:left w:val="single" w:sz="4" w:color="A8BBCB"/>
+              <w:bottom w:val="single" w:sz="4" w:color="A8BBCB"/>
+              <w:right w:val="single" w:sz="4" w:color="A8BBCB"/>
+              <w:insideH w:val="single" w:sz="4" w:color="A8BBCB"/>
+              <w:insideV w:val="single" w:sz="4" w:color="A8BBCB"/>
+            </w:tcBorders>
+            <w:tcMar>
+              <w:top w:w="90" w:type="dxa"/>
+              <w:start w:w="110" w:type="dxa"/>
+              <w:bottom w:w="90" w:type="dxa"/>
+              <w:end w:w="110" w:type="dxa"/>
+            </w:tcMar>
+            <w:vAlign w:val="top"/>
+          </w:tcPr>
+          <w:p>
+            <w:pPr>
+              <w:spacing w:after="0"/>
+            </w:pPr>
+            <w:r>
+              <w:rPr>
+                <w:rFonts w:ascii="Arial Unicode MS" w:hAnsi="Arial Unicode MS" w:eastAsia="Arial Unicode MS"/>
+                <w:color w:val="1E2933"/>
+                <w:sz w:val="17"/>
+              </w:rPr>
+              <w:t>验证</w:t>
+            </w:r>
+          </w:p>
+        </w:tc>
+        <w:tc>
+          <w:tcPr>
+            <w:tcW w:type="dxa" w:w="7257"/>
+            <w:shd w:fill="FFFFFF"/>
             <w:tcBorders>
               <w:top w:val="single" w:sz="4" w:color="A8BBCB"/>
               <w:left w:val="single" w:sz="4" w:color="A8BBCB"/>
@@ -16926,7 +17219,7 @@
                 <w:color w:val="1E2933"/>
                 <w:sz w:val="21"/>
               </w:rPr>
-              <w:t>当本章全部通过时，SDD2.0 在仓库可控边界达到 5/5：入口稳定、流程闭环、审批可追溯、范围确定、质量 Gate 可验证、失败可恢复且归档不可伪成功。</w:t>
+              <w:t>当本章全部通过时，SDD2.0 在仓库可控边界达到 5/5：入口稳定、中文资产一致、流程闭环、审批可追溯、范围确定、质量 Gate 可验证、失败可恢复且归档不可伪成功。</w:t>
             </w:r>
           </w:p>
         </w:tc>

</xml_diff>